<commit_message>
S159 學校版分校類 mass-gen: 13域 per-type docx (小/中/特) + 修 gen_school_docx undefined 章節 bug
- gen_school_docx.js: 修 ch.section_no/name(undefined)→ch.si + checklist sections[si-1].name；加 <type> filter
- gen_checklist_docx.js: 加 <type> filter + sequential 重編 + 源表只列用到源
- apply_school_types.py / add_facility_carveouts.py / gen_all.py: tagging→school_types + mass-gen driver
- _school_type_tags.json: 13域 348 carve-outs (9域背景 Workflow tagging + safety/curriculum facility carve-outs per Leonard 科目→校類 ruling)
- 13域 checklist.json/clauses.json: 加 school_types field (語義 diff 證零內容污染)
- 102 docx: 全 0 undefined, per-type filter 互斥實證, kg_admission generic 順手修 bug

Co-Authored-By: Claude Opus 4.8 (1M context) <noreply@anthropic.com>
</commit_message>
<xml_diff>
--- a/dev/checklists/activity/本校全方位學習及活動政策_學校版_DRAFT.docx
+++ b/dev/checklists/activity/本校全方位學習及活動政策_學校版_DRAFT.docx
@@ -179,7 +179,7 @@
           <w:sz w:val="28"/>
           <w:szCs w:val="28"/>
         </w:rPr>
-        <w:t xml:space="preserve">undefined. undefined</w:t>
+        <w:t xml:space="preserve">1. 安全與帶隊要求</w:t>
       </w:r>
     </w:p>
     <w:p>
@@ -195,7 +195,7 @@
           <w:sz w:val="22"/>
           <w:szCs w:val="22"/>
         </w:rPr>
-        <w:t xml:space="preserve">undefined.1　</w:t>
+        <w:t xml:space="preserve">1.1　</w:t>
       </w:r>
       <w:r>
         <w:rPr>
@@ -247,7 +247,7 @@
           <w:sz w:val="22"/>
           <w:szCs w:val="22"/>
         </w:rPr>
-        <w:t xml:space="preserve">undefined.2　</w:t>
+        <w:t xml:space="preserve">1.2　</w:t>
       </w:r>
       <w:r>
         <w:rPr>
@@ -281,7 +281,7 @@
           <w:sz w:val="22"/>
           <w:szCs w:val="22"/>
         </w:rPr>
-        <w:t xml:space="preserve">undefined.3　</w:t>
+        <w:t xml:space="preserve">1.3　</w:t>
       </w:r>
       <w:r>
         <w:rPr>
@@ -401,7 +401,7 @@
           <w:sz w:val="22"/>
           <w:szCs w:val="22"/>
         </w:rPr>
-        <w:t xml:space="preserve">undefined.4　</w:t>
+        <w:t xml:space="preserve">1.4　</w:t>
       </w:r>
       <w:r>
         <w:rPr>
@@ -437,7 +437,7 @@
           <w:sz w:val="22"/>
           <w:szCs w:val="22"/>
         </w:rPr>
-        <w:t xml:space="preserve">undefined.5　</w:t>
+        <w:t xml:space="preserve">1.5　</w:t>
       </w:r>
       <w:r>
         <w:rPr>
@@ -843,7 +843,7 @@
           <w:sz w:val="22"/>
           <w:szCs w:val="22"/>
         </w:rPr>
-        <w:t xml:space="preserve">undefined.6　</w:t>
+        <w:t xml:space="preserve">1.6　</w:t>
       </w:r>
       <w:r>
         <w:rPr>
@@ -1267,7 +1267,7 @@
           <w:sz w:val="22"/>
           <w:szCs w:val="22"/>
         </w:rPr>
-        <w:t xml:space="preserve">undefined.7　</w:t>
+        <w:t xml:space="preserve">1.7　</w:t>
       </w:r>
       <w:r>
         <w:rPr>
@@ -1340,7 +1340,7 @@
           <w:sz w:val="22"/>
           <w:szCs w:val="22"/>
         </w:rPr>
-        <w:t xml:space="preserve">undefined.8　</w:t>
+        <w:t xml:space="preserve">1.8　</w:t>
       </w:r>
       <w:r>
         <w:rPr>
@@ -1391,7 +1391,7 @@
         </w:rPr>
         <w:t xml:space="preserve">1　</w:t>
       </w:r>
-      <w:hyperlink w:history="1" r:id="rIdjedhyojjyhxcglguwek0y">
+      <w:hyperlink w:history="1" r:id="rIdzotyoz9bln2nmpqjo44ns">
         <w:r>
           <w:rPr>
             <w:rStyle w:val="Hyperlink"/>
@@ -1417,7 +1417,7 @@
         </w:rPr>
         <w:t xml:space="preserve">2, 4　</w:t>
       </w:r>
-      <w:hyperlink w:history="1" r:id="rId6hitwwko4thcrbjt3zyop">
+      <w:hyperlink w:history="1" r:id="rIdje1viwt40tvojawj2b6m6">
         <w:r>
           <w:rPr>
             <w:rStyle w:val="Hyperlink"/>
@@ -1443,7 +1443,7 @@
         </w:rPr>
         <w:t xml:space="preserve">3　</w:t>
       </w:r>
-      <w:hyperlink w:history="1" r:id="rIdlczw75spzanri1n_hxu6x">
+      <w:hyperlink w:history="1" r:id="rIdvhm8xijhdkq5eqf7j1729">
         <w:r>
           <w:rPr>
             <w:rStyle w:val="Hyperlink"/>
@@ -1469,7 +1469,7 @@
         </w:rPr>
         <w:t xml:space="preserve">5　</w:t>
       </w:r>
-      <w:hyperlink w:history="1" r:id="rIdlmij-hiy_8regsitocrjg">
+      <w:hyperlink w:history="1" r:id="rId6hr4qlnhinwl9w5s2y1zf">
         <w:r>
           <w:rPr>
             <w:rStyle w:val="Hyperlink"/>
@@ -1495,7 +1495,7 @@
         </w:rPr>
         <w:t xml:space="preserve">6　</w:t>
       </w:r>
-      <w:hyperlink w:history="1" r:id="rIdzrkgw7gay1by8daeo9qf5">
+      <w:hyperlink w:history="1" r:id="rIdvflndk3hhefw5rjp72cej">
         <w:r>
           <w:rPr>
             <w:rStyle w:val="Hyperlink"/>
@@ -1521,7 +1521,7 @@
         </w:rPr>
         <w:t xml:space="preserve">7　</w:t>
       </w:r>
-      <w:hyperlink w:history="1" r:id="rId3uuuv5akke1upnlyastuz">
+      <w:hyperlink w:history="1" r:id="rIdum238gnj-gvw6bru_ixij">
         <w:r>
           <w:rPr>
             <w:rStyle w:val="Hyperlink"/>
@@ -1547,7 +1547,7 @@
         </w:rPr>
         <w:t xml:space="preserve">8　</w:t>
       </w:r>
-      <w:hyperlink w:history="1" r:id="rIduhnsiw0kofuy0-f4fhnl4">
+      <w:hyperlink w:history="1" r:id="rIdovsfwakx8vfw8akolsm9h">
         <w:r>
           <w:rPr>
             <w:rStyle w:val="Hyperlink"/>
@@ -1573,7 +1573,7 @@
         </w:rPr>
         <w:t xml:space="preserve">9　</w:t>
       </w:r>
-      <w:hyperlink w:history="1" r:id="rId2zujultohqodysw7rbbk6">
+      <w:hyperlink w:history="1" r:id="rIdwi8rauoxidyn0brbigs4j">
         <w:r>
           <w:rPr>
             <w:rStyle w:val="Hyperlink"/>
@@ -1599,7 +1599,7 @@
         </w:rPr>
         <w:t xml:space="preserve">10　</w:t>
       </w:r>
-      <w:hyperlink w:history="1" r:id="rIdmevudjld32hssuaxmhk1w">
+      <w:hyperlink w:history="1" r:id="rId3wdsa781_vtjcbl8p3rzu">
         <w:r>
           <w:rPr>
             <w:rStyle w:val="Hyperlink"/>
@@ -1625,7 +1625,7 @@
         </w:rPr>
         <w:t xml:space="preserve">11　</w:t>
       </w:r>
-      <w:hyperlink w:history="1" r:id="rIdup2ae5zcerpd7gvunrcut">
+      <w:hyperlink w:history="1" r:id="rIdieol3qay2qjrqsaiexnxu">
         <w:r>
           <w:rPr>
             <w:rStyle w:val="Hyperlink"/>
@@ -1651,7 +1651,7 @@
         </w:rPr>
         <w:t xml:space="preserve">12　</w:t>
       </w:r>
-      <w:hyperlink w:history="1" r:id="rIdg22bgf5umjx88hnzygicl">
+      <w:hyperlink w:history="1" r:id="rId-luxcepkpildgwpxlobqc">
         <w:r>
           <w:rPr>
             <w:rStyle w:val="Hyperlink"/>
@@ -1677,7 +1677,7 @@
         </w:rPr>
         <w:t xml:space="preserve">13　</w:t>
       </w:r>
-      <w:hyperlink w:history="1" r:id="rIdr4cwqxwyk2pssrfbrbzq8">
+      <w:hyperlink w:history="1" r:id="rIdb6fosu0rf-oj79p0hasb_">
         <w:r>
           <w:rPr>
             <w:rStyle w:val="Hyperlink"/>
@@ -1703,7 +1703,7 @@
           <w:sz w:val="28"/>
           <w:szCs w:val="28"/>
         </w:rPr>
-        <w:t xml:space="preserve">undefined. undefined</w:t>
+        <w:t xml:space="preserve">2. 境外遊學管理</w:t>
       </w:r>
     </w:p>
     <w:p>
@@ -1719,7 +1719,7 @@
           <w:sz w:val="22"/>
           <w:szCs w:val="22"/>
         </w:rPr>
-        <w:t xml:space="preserve">undefined.1　</w:t>
+        <w:t xml:space="preserve">2.1　</w:t>
       </w:r>
       <w:r>
         <w:rPr>
@@ -1771,7 +1771,7 @@
           <w:sz w:val="22"/>
           <w:szCs w:val="22"/>
         </w:rPr>
-        <w:t xml:space="preserve">undefined.2　</w:t>
+        <w:t xml:space="preserve">2.2　</w:t>
       </w:r>
       <w:r>
         <w:rPr>
@@ -2195,7 +2195,7 @@
           <w:sz w:val="22"/>
           <w:szCs w:val="22"/>
         </w:rPr>
-        <w:t xml:space="preserve">undefined.3　</w:t>
+        <w:t xml:space="preserve">2.3　</w:t>
       </w:r>
       <w:r>
         <w:rPr>
@@ -2247,7 +2247,7 @@
           <w:sz w:val="22"/>
           <w:szCs w:val="22"/>
         </w:rPr>
-        <w:t xml:space="preserve">undefined.4　</w:t>
+        <w:t xml:space="preserve">2.4　</w:t>
       </w:r>
       <w:r>
         <w:rPr>
@@ -2281,7 +2281,7 @@
           <w:sz w:val="22"/>
           <w:szCs w:val="22"/>
         </w:rPr>
-        <w:t xml:space="preserve">undefined.5　</w:t>
+        <w:t xml:space="preserve">2.5　</w:t>
       </w:r>
       <w:r>
         <w:rPr>
@@ -2315,7 +2315,7 @@
           <w:sz w:val="22"/>
           <w:szCs w:val="22"/>
         </w:rPr>
-        <w:t xml:space="preserve">undefined.6　</w:t>
+        <w:t xml:space="preserve">2.6　</w:t>
       </w:r>
       <w:r>
         <w:rPr>
@@ -2627,7 +2627,7 @@
           <w:sz w:val="22"/>
           <w:szCs w:val="22"/>
         </w:rPr>
-        <w:t xml:space="preserve">undefined.7　</w:t>
+        <w:t xml:space="preserve">2.7　</w:t>
       </w:r>
       <w:r>
         <w:rPr>
@@ -2713,7 +2713,7 @@
           <w:sz w:val="22"/>
           <w:szCs w:val="22"/>
         </w:rPr>
-        <w:t xml:space="preserve">undefined.8　</w:t>
+        <w:t xml:space="preserve">2.8　</w:t>
       </w:r>
       <w:r>
         <w:rPr>
@@ -2781,7 +2781,7 @@
         </w:rPr>
         <w:t xml:space="preserve">1, 11　</w:t>
       </w:r>
-      <w:hyperlink w:history="1" r:id="rIdh_obn4wnu8lrqgbch5_2s">
+      <w:hyperlink w:history="1" r:id="rId5y9hljoy7y28-_0bcybea">
         <w:r>
           <w:rPr>
             <w:rStyle w:val="Hyperlink"/>
@@ -2807,7 +2807,7 @@
         </w:rPr>
         <w:t xml:space="preserve">2, 6, 7, 8, 9, 12, 13　</w:t>
       </w:r>
-      <w:hyperlink w:history="1" r:id="rId_rb3v4l-0do15zfb-pmrx">
+      <w:hyperlink w:history="1" r:id="rIdd9-jdg5e0h56t64zv2stu">
         <w:r>
           <w:rPr>
             <w:rStyle w:val="Hyperlink"/>
@@ -2833,7 +2833,7 @@
         </w:rPr>
         <w:t xml:space="preserve">3, 10　</w:t>
       </w:r>
-      <w:hyperlink w:history="1" r:id="rIdadqxwsv3yduj00idpj8_i">
+      <w:hyperlink w:history="1" r:id="rId_bcfhymh7lb56jyyketbi">
         <w:r>
           <w:rPr>
             <w:rStyle w:val="Hyperlink"/>
@@ -2859,7 +2859,7 @@
         </w:rPr>
         <w:t xml:space="preserve">4　</w:t>
       </w:r>
-      <w:hyperlink w:history="1" r:id="rIdunzehljgcaepys2r6rmnd">
+      <w:hyperlink w:history="1" r:id="rIdfplldda143z_bryxabvxs">
         <w:r>
           <w:rPr>
             <w:rStyle w:val="Hyperlink"/>
@@ -2885,7 +2885,7 @@
         </w:rPr>
         <w:t xml:space="preserve">5　</w:t>
       </w:r>
-      <w:hyperlink w:history="1" r:id="rIdltlqiy7uh__pi8uiennmr">
+      <w:hyperlink w:history="1" r:id="rIdaoqtlyujluqtgcoshu0n7">
         <w:r>
           <w:rPr>
             <w:rStyle w:val="Hyperlink"/>
@@ -2911,7 +2911,7 @@
           <w:sz w:val="28"/>
           <w:szCs w:val="28"/>
         </w:rPr>
-        <w:t xml:space="preserve">undefined. undefined</w:t>
+        <w:t xml:space="preserve">3. 全方位學習津貼</w:t>
       </w:r>
     </w:p>
     <w:p>
@@ -2927,7 +2927,7 @@
           <w:sz w:val="22"/>
           <w:szCs w:val="22"/>
         </w:rPr>
-        <w:t xml:space="preserve">undefined.1　</w:t>
+        <w:t xml:space="preserve">3.1　</w:t>
       </w:r>
       <w:r>
         <w:rPr>
@@ -3013,7 +3013,7 @@
           <w:sz w:val="22"/>
           <w:szCs w:val="22"/>
         </w:rPr>
-        <w:t xml:space="preserve">undefined.2　</w:t>
+        <w:t xml:space="preserve">3.2　</w:t>
       </w:r>
       <w:r>
         <w:rPr>
@@ -3064,7 +3064,7 @@
           <w:sz w:val="22"/>
           <w:szCs w:val="22"/>
         </w:rPr>
-        <w:t xml:space="preserve">undefined.3　</w:t>
+        <w:t xml:space="preserve">3.3　</w:t>
       </w:r>
       <w:r>
         <w:rPr>
@@ -3098,7 +3098,7 @@
           <w:sz w:val="22"/>
           <w:szCs w:val="22"/>
         </w:rPr>
-        <w:t xml:space="preserve">undefined.4　</w:t>
+        <w:t xml:space="preserve">3.4　</w:t>
       </w:r>
       <w:r>
         <w:rPr>
@@ -3690,7 +3690,7 @@
           <w:sz w:val="22"/>
           <w:szCs w:val="22"/>
         </w:rPr>
-        <w:t xml:space="preserve">undefined.5　</w:t>
+        <w:t xml:space="preserve">3.5　</w:t>
       </w:r>
       <w:r>
         <w:rPr>
@@ -3758,7 +3758,7 @@
           <w:sz w:val="22"/>
           <w:szCs w:val="22"/>
         </w:rPr>
-        <w:t xml:space="preserve">undefined.6　</w:t>
+        <w:t xml:space="preserve">3.6　</w:t>
       </w:r>
       <w:r>
         <w:rPr>
@@ -3818,7 +3818,7 @@
         </w:rPr>
         <w:t xml:space="preserve">1, 3　</w:t>
       </w:r>
-      <w:hyperlink w:history="1" r:id="rId43otjirhh9wmmggh5_08r">
+      <w:hyperlink w:history="1" r:id="rId2evc7e-mtnzqwvgk4qn9p">
         <w:r>
           <w:rPr>
             <w:rStyle w:val="Hyperlink"/>
@@ -3844,7 +3844,7 @@
         </w:rPr>
         <w:t xml:space="preserve">2, 4, 6, 8　</w:t>
       </w:r>
-      <w:hyperlink w:history="1" r:id="rIdc_kqddq7h2omiubhnmhqh">
+      <w:hyperlink w:history="1" r:id="rIdcgui8vrjgucdv3tphxkbj">
         <w:r>
           <w:rPr>
             <w:rStyle w:val="Hyperlink"/>
@@ -3870,7 +3870,7 @@
         </w:rPr>
         <w:t xml:space="preserve">5　</w:t>
       </w:r>
-      <w:hyperlink w:history="1" r:id="rIdr6jz1mg07rnwou2znnnch">
+      <w:hyperlink w:history="1" r:id="rIdnxs46c3g5n8idk9aco0tz">
         <w:r>
           <w:rPr>
             <w:rStyle w:val="Hyperlink"/>
@@ -3896,7 +3896,7 @@
         </w:rPr>
         <w:t xml:space="preserve">7　</w:t>
       </w:r>
-      <w:hyperlink w:history="1" r:id="rIdclm5s45w4duf03hbw89gk">
+      <w:hyperlink w:history="1" r:id="rIdwzjmd-bzlayz0dongsni4">
         <w:r>
           <w:rPr>
             <w:rStyle w:val="Hyperlink"/>
@@ -3922,7 +3922,7 @@
           <w:sz w:val="28"/>
           <w:szCs w:val="28"/>
         </w:rPr>
-        <w:t xml:space="preserve">undefined. undefined</w:t>
+        <w:t xml:space="preserve">4. 出發前準備程序</w:t>
       </w:r>
     </w:p>
     <w:p>
@@ -3938,7 +3938,7 @@
           <w:sz w:val="22"/>
           <w:szCs w:val="22"/>
         </w:rPr>
-        <w:t xml:space="preserve">undefined.1　</w:t>
+        <w:t xml:space="preserve">4.1　</w:t>
       </w:r>
       <w:r>
         <w:rPr>
@@ -4008,7 +4008,7 @@
           <w:sz w:val="22"/>
           <w:szCs w:val="22"/>
         </w:rPr>
-        <w:t xml:space="preserve">undefined.2　</w:t>
+        <w:t xml:space="preserve">4.2　</w:t>
       </w:r>
       <w:r>
         <w:rPr>
@@ -4042,7 +4042,7 @@
           <w:sz w:val="22"/>
           <w:szCs w:val="22"/>
         </w:rPr>
-        <w:t xml:space="preserve">undefined.3　</w:t>
+        <w:t xml:space="preserve">4.3　</w:t>
       </w:r>
       <w:r>
         <w:rPr>
@@ -4726,7 +4726,7 @@
           <w:sz w:val="22"/>
           <w:szCs w:val="22"/>
         </w:rPr>
-        <w:t xml:space="preserve">undefined.4　</w:t>
+        <w:t xml:space="preserve">4.4　</w:t>
       </w:r>
       <w:r>
         <w:rPr>
@@ -4777,7 +4777,7 @@
           <w:sz w:val="22"/>
           <w:szCs w:val="22"/>
         </w:rPr>
-        <w:t xml:space="preserve">undefined.5　</w:t>
+        <w:t xml:space="preserve">4.5　</w:t>
       </w:r>
       <w:r>
         <w:rPr>
@@ -4828,7 +4828,7 @@
           <w:sz w:val="22"/>
           <w:szCs w:val="22"/>
         </w:rPr>
-        <w:t xml:space="preserve">undefined.6　</w:t>
+        <w:t xml:space="preserve">4.6　</w:t>
       </w:r>
       <w:r>
         <w:rPr>
@@ -5251,7 +5251,7 @@
         </w:rPr>
         <w:t xml:space="preserve">1, 4, 6　</w:t>
       </w:r>
-      <w:hyperlink w:history="1" r:id="rIdhpcoxfwnoqdpr-7stxmmx">
+      <w:hyperlink w:history="1" r:id="rIdvhpjkmbf6aulwa4x29lae">
         <w:r>
           <w:rPr>
             <w:rStyle w:val="Hyperlink"/>
@@ -5277,7 +5277,7 @@
         </w:rPr>
         <w:t xml:space="preserve">2　</w:t>
       </w:r>
-      <w:hyperlink w:history="1" r:id="rIdaimmy7begf0psy7g3ywse">
+      <w:hyperlink w:history="1" r:id="rIdzunpo-ynbkb8b9c1o62xq">
         <w:r>
           <w:rPr>
             <w:rStyle w:val="Hyperlink"/>
@@ -5303,7 +5303,7 @@
         </w:rPr>
         <w:t xml:space="preserve">3, 11　</w:t>
       </w:r>
-      <w:hyperlink w:history="1" r:id="rIdhrf-kc3k8dfdt2pcrv4qx">
+      <w:hyperlink w:history="1" r:id="rId7dmwnmw5dyahvfsauhlg0">
         <w:r>
           <w:rPr>
             <w:rStyle w:val="Hyperlink"/>
@@ -5329,7 +5329,7 @@
         </w:rPr>
         <w:t xml:space="preserve">5　</w:t>
       </w:r>
-      <w:hyperlink w:history="1" r:id="rIdibcyiqkqcgzk9qidky1xh">
+      <w:hyperlink w:history="1" r:id="rId7okf7uf01jhjbuh2pzwhj">
         <w:r>
           <w:rPr>
             <w:rStyle w:val="Hyperlink"/>
@@ -5355,7 +5355,7 @@
         </w:rPr>
         <w:t xml:space="preserve">7　</w:t>
       </w:r>
-      <w:hyperlink w:history="1" r:id="rIdascjtwx-unzcl3s3axbzw">
+      <w:hyperlink w:history="1" r:id="rIdiitzk_ftsam6xjfyuvsvm">
         <w:r>
           <w:rPr>
             <w:rStyle w:val="Hyperlink"/>
@@ -5381,7 +5381,7 @@
         </w:rPr>
         <w:t xml:space="preserve">8, 9　</w:t>
       </w:r>
-      <w:hyperlink w:history="1" r:id="rIdccrepbph131l6fadqug9l">
+      <w:hyperlink w:history="1" r:id="rIduebdhb8nlj5ohl9c10w2c">
         <w:r>
           <w:rPr>
             <w:rStyle w:val="Hyperlink"/>
@@ -5407,7 +5407,7 @@
         </w:rPr>
         <w:t xml:space="preserve">10　</w:t>
       </w:r>
-      <w:hyperlink w:history="1" r:id="rIdmoxwvmngxsu20inn7ddfd">
+      <w:hyperlink w:history="1" r:id="rIdovuzg99tgszxsgdhlibls">
         <w:r>
           <w:rPr>
             <w:rStyle w:val="Hyperlink"/>
@@ -5433,7 +5433,7 @@
           <w:sz w:val="28"/>
           <w:szCs w:val="28"/>
         </w:rPr>
-        <w:t xml:space="preserve">undefined. undefined</w:t>
+        <w:t xml:space="preserve">5. 活動期間安全管理</w:t>
       </w:r>
     </w:p>
     <w:p>
@@ -5449,7 +5449,7 @@
           <w:sz w:val="22"/>
           <w:szCs w:val="22"/>
         </w:rPr>
-        <w:t xml:space="preserve">undefined.1　</w:t>
+        <w:t xml:space="preserve">5.1　</w:t>
       </w:r>
       <w:r>
         <w:rPr>
@@ -5873,7 +5873,7 @@
           <w:sz w:val="22"/>
           <w:szCs w:val="22"/>
         </w:rPr>
-        <w:t xml:space="preserve">undefined.2　</w:t>
+        <w:t xml:space="preserve">5.2　</w:t>
       </w:r>
       <w:r>
         <w:rPr>
@@ -5925,7 +5925,7 @@
           <w:sz w:val="22"/>
           <w:szCs w:val="22"/>
         </w:rPr>
-        <w:t xml:space="preserve">undefined.3　</w:t>
+        <w:t xml:space="preserve">5.3　</w:t>
       </w:r>
       <w:r>
         <w:rPr>
@@ -5959,7 +5959,7 @@
           <w:sz w:val="22"/>
           <w:szCs w:val="22"/>
         </w:rPr>
-        <w:t xml:space="preserve">undefined.4　</w:t>
+        <w:t xml:space="preserve">5.4　</w:t>
       </w:r>
       <w:r>
         <w:rPr>
@@ -5993,7 +5993,7 @@
           <w:sz w:val="22"/>
           <w:szCs w:val="22"/>
         </w:rPr>
-        <w:t xml:space="preserve">undefined.5　</w:t>
+        <w:t xml:space="preserve">5.5　</w:t>
       </w:r>
       <w:r>
         <w:rPr>
@@ -6231,7 +6231,7 @@
           <w:sz w:val="22"/>
           <w:szCs w:val="22"/>
         </w:rPr>
-        <w:t xml:space="preserve">undefined.6　</w:t>
+        <w:t xml:space="preserve">5.6　</w:t>
       </w:r>
       <w:r>
         <w:rPr>
@@ -6318,7 +6318,7 @@
           <w:sz w:val="22"/>
           <w:szCs w:val="22"/>
         </w:rPr>
-        <w:t xml:space="preserve">undefined.7　</w:t>
+        <w:t xml:space="preserve">5.7　</w:t>
       </w:r>
       <w:r>
         <w:rPr>
@@ -6369,7 +6369,7 @@
         </w:rPr>
         <w:t xml:space="preserve">1, 3, 5　</w:t>
       </w:r>
-      <w:hyperlink w:history="1" r:id="rId_qhaot4hq2l6pmouot_lx">
+      <w:hyperlink w:history="1" r:id="rIdxnvdfqxwlftbgqwmswthi">
         <w:r>
           <w:rPr>
             <w:rStyle w:val="Hyperlink"/>
@@ -6395,7 +6395,7 @@
         </w:rPr>
         <w:t xml:space="preserve">2　</w:t>
       </w:r>
-      <w:hyperlink w:history="1" r:id="rIdwpff-6g79wm5eiiyedyps">
+      <w:hyperlink w:history="1" r:id="rId5chp67leweplio3yihfv0">
         <w:r>
           <w:rPr>
             <w:rStyle w:val="Hyperlink"/>
@@ -6421,7 +6421,7 @@
         </w:rPr>
         <w:t xml:space="preserve">4, 6　</w:t>
       </w:r>
-      <w:hyperlink w:history="1" r:id="rIdeo6ozcs4q3xwe1bcnel6s">
+      <w:hyperlink w:history="1" r:id="rIdw5wfe3yaeobn89rqlcw5u">
         <w:r>
           <w:rPr>
             <w:rStyle w:val="Hyperlink"/>
@@ -6447,7 +6447,7 @@
         </w:rPr>
         <w:t xml:space="preserve">7　</w:t>
       </w:r>
-      <w:hyperlink w:history="1" r:id="rIdve04hmbesuc6reyua-5p_">
+      <w:hyperlink w:history="1" r:id="rId5xextjrhak8yptf4uk0vi">
         <w:r>
           <w:rPr>
             <w:rStyle w:val="Hyperlink"/>
@@ -6473,7 +6473,7 @@
         </w:rPr>
         <w:t xml:space="preserve">8　</w:t>
       </w:r>
-      <w:hyperlink w:history="1" r:id="rIdfyj5qvslo2aiivrhfqjsn">
+      <w:hyperlink w:history="1" r:id="rIdorvb6bkyzdcndh76osn4r">
         <w:r>
           <w:rPr>
             <w:rStyle w:val="Hyperlink"/>
@@ -6499,7 +6499,7 @@
         </w:rPr>
         <w:t xml:space="preserve">9　</w:t>
       </w:r>
-      <w:hyperlink w:history="1" r:id="rIdahx61kqz1uuk-p0_xawqh">
+      <w:hyperlink w:history="1" r:id="rIdnhf7fteekjjvjg_gu5pdj">
         <w:r>
           <w:rPr>
             <w:rStyle w:val="Hyperlink"/>
@@ -6525,7 +6525,7 @@
         </w:rPr>
         <w:t xml:space="preserve">10　</w:t>
       </w:r>
-      <w:hyperlink w:history="1" r:id="rIdybpctudh0ywpzrv7abych">
+      <w:hyperlink w:history="1" r:id="rIdqtncivmiclmf_m3vid5jv">
         <w:r>
           <w:rPr>
             <w:rStyle w:val="Hyperlink"/>
@@ -6551,7 +6551,7 @@
         </w:rPr>
         <w:t xml:space="preserve">11　</w:t>
       </w:r>
-      <w:hyperlink w:history="1" r:id="rIdd6cpieujwrk39fans8bba">
+      <w:hyperlink w:history="1" r:id="rIdjqmbznutt3lq5ip3m9muv">
         <w:r>
           <w:rPr>
             <w:rStyle w:val="Hyperlink"/>
@@ -6577,7 +6577,7 @@
           <w:sz w:val="28"/>
           <w:szCs w:val="28"/>
         </w:rPr>
-        <w:t xml:space="preserve">undefined. undefined</w:t>
+        <w:t xml:space="preserve">6. 水上活動安全</w:t>
       </w:r>
     </w:p>
     <w:p>
@@ -6593,7 +6593,7 @@
           <w:sz w:val="22"/>
           <w:szCs w:val="22"/>
         </w:rPr>
-        <w:t xml:space="preserve">undefined.1　</w:t>
+        <w:t xml:space="preserve">6.1　</w:t>
       </w:r>
       <w:r>
         <w:rPr>
@@ -6636,7 +6636,7 @@
           <w:sz w:val="22"/>
           <w:szCs w:val="22"/>
         </w:rPr>
-        <w:t xml:space="preserve">undefined.2　</w:t>
+        <w:t xml:space="preserve">6.2　</w:t>
       </w:r>
       <w:r>
         <w:rPr>
@@ -7188,7 +7188,7 @@
           <w:sz w:val="22"/>
           <w:szCs w:val="22"/>
         </w:rPr>
-        <w:t xml:space="preserve">undefined.3　</w:t>
+        <w:t xml:space="preserve">6.3　</w:t>
       </w:r>
       <w:r>
         <w:rPr>
@@ -7258,7 +7258,7 @@
           <w:sz w:val="22"/>
           <w:szCs w:val="22"/>
         </w:rPr>
-        <w:t xml:space="preserve">undefined.4　</w:t>
+        <w:t xml:space="preserve">6.4　</w:t>
       </w:r>
       <w:r>
         <w:rPr>
@@ -7301,7 +7301,7 @@
           <w:sz w:val="22"/>
           <w:szCs w:val="22"/>
         </w:rPr>
-        <w:t xml:space="preserve">undefined.5　</w:t>
+        <w:t xml:space="preserve">6.5　</w:t>
       </w:r>
       <w:r>
         <w:rPr>
@@ -7335,7 +7335,7 @@
           <w:sz w:val="22"/>
           <w:szCs w:val="22"/>
         </w:rPr>
-        <w:t xml:space="preserve">undefined.6　</w:t>
+        <w:t xml:space="preserve">6.6　</w:t>
       </w:r>
       <w:r>
         <w:rPr>
@@ -7421,7 +7421,7 @@
         </w:rPr>
         <w:t xml:space="preserve">1, 2, 9　</w:t>
       </w:r>
-      <w:hyperlink w:history="1" r:id="rIdrd1sazt8kynxyy-vhndw4">
+      <w:hyperlink w:history="1" r:id="rIdbwzjr3xzblos4ca14ngup">
         <w:r>
           <w:rPr>
             <w:rStyle w:val="Hyperlink"/>
@@ -7447,7 +7447,7 @@
         </w:rPr>
         <w:t xml:space="preserve">3, 6　</w:t>
       </w:r>
-      <w:hyperlink w:history="1" r:id="rIdzeomtjjstfhmvomnxpnmc">
+      <w:hyperlink w:history="1" r:id="rIdrrbqb2s2njd3dofpvlbot">
         <w:r>
           <w:rPr>
             <w:rStyle w:val="Hyperlink"/>
@@ -7473,7 +7473,7 @@
         </w:rPr>
         <w:t xml:space="preserve">4　</w:t>
       </w:r>
-      <w:hyperlink w:history="1" r:id="rIdghe1leedij5txkiduohuv">
+      <w:hyperlink w:history="1" r:id="rIdspncdrkux448ookmsmuek">
         <w:r>
           <w:rPr>
             <w:rStyle w:val="Hyperlink"/>
@@ -7499,7 +7499,7 @@
         </w:rPr>
         <w:t xml:space="preserve">5, 8, 10, 11　</w:t>
       </w:r>
-      <w:hyperlink w:history="1" r:id="rIdp0ysoqomyu1zipn2lutfk">
+      <w:hyperlink w:history="1" r:id="rIdlue10kb3tytmebnlie_jm">
         <w:r>
           <w:rPr>
             <w:rStyle w:val="Hyperlink"/>
@@ -7525,7 +7525,7 @@
         </w:rPr>
         <w:t xml:space="preserve">7　</w:t>
       </w:r>
-      <w:hyperlink w:history="1" r:id="rIdcf_rrjjg4kg3vukxlxlpc">
+      <w:hyperlink w:history="1" r:id="rIdd4odiz_hnn-61jmhutx-y">
         <w:r>
           <w:rPr>
             <w:rStyle w:val="Hyperlink"/>
@@ -7551,7 +7551,7 @@
         </w:rPr>
         <w:t xml:space="preserve">12　</w:t>
       </w:r>
-      <w:hyperlink w:history="1" r:id="rIdh2bx1ydd811na-i_bcs3x">
+      <w:hyperlink w:history="1" r:id="rId3lobwpoiiilq646eynpnz">
         <w:r>
           <w:rPr>
             <w:rStyle w:val="Hyperlink"/>
@@ -7577,7 +7577,7 @@
           <w:sz w:val="28"/>
           <w:szCs w:val="28"/>
         </w:rPr>
-        <w:t xml:space="preserve">undefined. undefined</w:t>
+        <w:t xml:space="preserve">7. 活動規劃與審批</w:t>
       </w:r>
     </w:p>
     <w:p>
@@ -7593,7 +7593,7 @@
           <w:sz w:val="22"/>
           <w:szCs w:val="22"/>
         </w:rPr>
-        <w:t xml:space="preserve">undefined.1　</w:t>
+        <w:t xml:space="preserve">7.1　</w:t>
       </w:r>
       <w:r>
         <w:rPr>
@@ -7627,7 +7627,7 @@
           <w:sz w:val="22"/>
           <w:szCs w:val="22"/>
         </w:rPr>
-        <w:t xml:space="preserve">undefined.2　</w:t>
+        <w:t xml:space="preserve">7.2　</w:t>
       </w:r>
       <w:r>
         <w:rPr>
@@ -7678,7 +7678,7 @@
           <w:sz w:val="22"/>
           <w:szCs w:val="22"/>
         </w:rPr>
-        <w:t xml:space="preserve">undefined.3　</w:t>
+        <w:t xml:space="preserve">7.3　</w:t>
       </w:r>
       <w:r>
         <w:rPr>
@@ -7764,7 +7764,7 @@
           <w:sz w:val="22"/>
           <w:szCs w:val="22"/>
         </w:rPr>
-        <w:t xml:space="preserve">undefined.4　</w:t>
+        <w:t xml:space="preserve">7.4　</w:t>
       </w:r>
       <w:r>
         <w:rPr>
@@ -7798,7 +7798,7 @@
           <w:sz w:val="22"/>
           <w:szCs w:val="22"/>
         </w:rPr>
-        <w:t xml:space="preserve">undefined.5　</w:t>
+        <w:t xml:space="preserve">7.5　</w:t>
       </w:r>
       <w:r>
         <w:rPr>
@@ -7832,7 +7832,7 @@
           <w:sz w:val="22"/>
           <w:szCs w:val="22"/>
         </w:rPr>
-        <w:t xml:space="preserve">undefined.6　</w:t>
+        <w:t xml:space="preserve">7.6　</w:t>
       </w:r>
       <w:r>
         <w:rPr>
@@ -8312,7 +8312,7 @@
           <w:sz w:val="22"/>
           <w:szCs w:val="22"/>
         </w:rPr>
-        <w:t xml:space="preserve">undefined.7　</w:t>
+        <w:t xml:space="preserve">7.7　</w:t>
       </w:r>
       <w:r>
         <w:rPr>
@@ -8718,7 +8718,7 @@
           <w:sz w:val="22"/>
           <w:szCs w:val="22"/>
         </w:rPr>
-        <w:t xml:space="preserve">undefined.8　</w:t>
+        <w:t xml:space="preserve">7.8　</w:t>
       </w:r>
       <w:r>
         <w:rPr>
@@ -8769,7 +8769,7 @@
         </w:rPr>
         <w:t xml:space="preserve">1　</w:t>
       </w:r>
-      <w:hyperlink w:history="1" r:id="rIdd8tgx91nfbhzne1fklefc">
+      <w:hyperlink w:history="1" r:id="rIdhr3peqebxw3wsboffeapn">
         <w:r>
           <w:rPr>
             <w:rStyle w:val="Hyperlink"/>
@@ -8795,7 +8795,7 @@
         </w:rPr>
         <w:t xml:space="preserve">2　</w:t>
       </w:r>
-      <w:hyperlink w:history="1" r:id="rId8mz-r-kicppeeqd9fzfef">
+      <w:hyperlink w:history="1" r:id="rIdj9gksknoe7zlp6rvvmayr">
         <w:r>
           <w:rPr>
             <w:rStyle w:val="Hyperlink"/>
@@ -8821,7 +8821,7 @@
         </w:rPr>
         <w:t xml:space="preserve">3　</w:t>
       </w:r>
-      <w:hyperlink w:history="1" r:id="rId6ir__40ymfljehegxeraj">
+      <w:hyperlink w:history="1" r:id="rId-d00nganqm-vce9rfodfu">
         <w:r>
           <w:rPr>
             <w:rStyle w:val="Hyperlink"/>
@@ -8847,7 +8847,7 @@
         </w:rPr>
         <w:t xml:space="preserve">4, 9, 10　</w:t>
       </w:r>
-      <w:hyperlink w:history="1" r:id="rIdynroaggu7xqtvsjn4y7ok">
+      <w:hyperlink w:history="1" r:id="rIdfyfanhqwk5-kxvoplfqil">
         <w:r>
           <w:rPr>
             <w:rStyle w:val="Hyperlink"/>
@@ -8873,7 +8873,7 @@
         </w:rPr>
         <w:t xml:space="preserve">5　</w:t>
       </w:r>
-      <w:hyperlink w:history="1" r:id="rIdrml62toqxssaw1cpukogy">
+      <w:hyperlink w:history="1" r:id="rIdnka6tefkmg9abpzalrssm">
         <w:r>
           <w:rPr>
             <w:rStyle w:val="Hyperlink"/>
@@ -8899,7 +8899,7 @@
         </w:rPr>
         <w:t xml:space="preserve">6　</w:t>
       </w:r>
-      <w:hyperlink w:history="1" r:id="rIdkwvvpmdbfrg_9md_k2km1">
+      <w:hyperlink w:history="1" r:id="rIdryfstvlfjlpvdu_a-exyp">
         <w:r>
           <w:rPr>
             <w:rStyle w:val="Hyperlink"/>
@@ -8925,7 +8925,7 @@
         </w:rPr>
         <w:t xml:space="preserve">7　</w:t>
       </w:r>
-      <w:hyperlink w:history="1" r:id="rId4iop3a10s5aykapj67mwh">
+      <w:hyperlink w:history="1" r:id="rIdcizqh1rycqxxwlczigkju">
         <w:r>
           <w:rPr>
             <w:rStyle w:val="Hyperlink"/>
@@ -8951,7 +8951,7 @@
         </w:rPr>
         <w:t xml:space="preserve">8　</w:t>
       </w:r>
-      <w:hyperlink w:history="1" r:id="rIdotl-rdsdtuwdywnblcyew">
+      <w:hyperlink w:history="1" r:id="rId6-gp8wbp6cplhmjsdb_ij">
         <w:r>
           <w:rPr>
             <w:rStyle w:val="Hyperlink"/>
@@ -8977,7 +8977,7 @@
           <w:sz w:val="28"/>
           <w:szCs w:val="28"/>
         </w:rPr>
-        <w:t xml:space="preserve">undefined. undefined</w:t>
+        <w:t xml:space="preserve">8. 惡劣天氣與取消安排</w:t>
       </w:r>
     </w:p>
     <w:p>
@@ -8993,7 +8993,7 @@
           <w:sz w:val="22"/>
           <w:szCs w:val="22"/>
         </w:rPr>
-        <w:t xml:space="preserve">undefined.1　</w:t>
+        <w:t xml:space="preserve">8.1　</w:t>
       </w:r>
       <w:r>
         <w:rPr>
@@ -9417,7 +9417,7 @@
           <w:sz w:val="22"/>
           <w:szCs w:val="22"/>
         </w:rPr>
-        <w:t xml:space="preserve">undefined.2　</w:t>
+        <w:t xml:space="preserve">8.2　</w:t>
       </w:r>
       <w:r>
         <w:rPr>
@@ -9451,7 +9451,7 @@
           <w:sz w:val="22"/>
           <w:szCs w:val="22"/>
         </w:rPr>
-        <w:t xml:space="preserve">undefined.3　</w:t>
+        <w:t xml:space="preserve">8.3　</w:t>
       </w:r>
       <w:r>
         <w:rPr>
@@ -9485,7 +9485,7 @@
           <w:sz w:val="22"/>
           <w:szCs w:val="22"/>
         </w:rPr>
-        <w:t xml:space="preserve">undefined.4　</w:t>
+        <w:t xml:space="preserve">8.4　</w:t>
       </w:r>
       <w:r>
         <w:rPr>
@@ -9519,7 +9519,7 @@
           <w:sz w:val="22"/>
           <w:szCs w:val="22"/>
         </w:rPr>
-        <w:t xml:space="preserve">undefined.5　</w:t>
+        <w:t xml:space="preserve">8.5　</w:t>
       </w:r>
       <w:r>
         <w:rPr>
@@ -9553,7 +9553,7 @@
           <w:sz w:val="22"/>
           <w:szCs w:val="22"/>
         </w:rPr>
-        <w:t xml:space="preserve">undefined.6　</w:t>
+        <w:t xml:space="preserve">8.6　</w:t>
       </w:r>
       <w:r>
         <w:rPr>
@@ -9809,7 +9809,7 @@
           <w:sz w:val="22"/>
           <w:szCs w:val="22"/>
         </w:rPr>
-        <w:t xml:space="preserve">undefined.7　</w:t>
+        <w:t xml:space="preserve">8.7　</w:t>
       </w:r>
       <w:r>
         <w:rPr>
@@ -9860,7 +9860,7 @@
         </w:rPr>
         <w:t xml:space="preserve">1　</w:t>
       </w:r>
-      <w:hyperlink w:history="1" r:id="rIdzrpu4fvb0x3vp0ej63ktn">
+      <w:hyperlink w:history="1" r:id="rIddxpxnh9opoc-0rpgm84sb">
         <w:r>
           <w:rPr>
             <w:rStyle w:val="Hyperlink"/>
@@ -9886,7 +9886,7 @@
         </w:rPr>
         <w:t xml:space="preserve">2　</w:t>
       </w:r>
-      <w:hyperlink w:history="1" r:id="rIdyjahzr4-bl8davnzen1f1">
+      <w:hyperlink w:history="1" r:id="rIdnmxlw3ft1inns9xnpzwt_">
         <w:r>
           <w:rPr>
             <w:rStyle w:val="Hyperlink"/>
@@ -9912,7 +9912,7 @@
         </w:rPr>
         <w:t xml:space="preserve">3　</w:t>
       </w:r>
-      <w:hyperlink w:history="1" r:id="rIdzkrol8yno4asvhlo9l5m_">
+      <w:hyperlink w:history="1" r:id="rIdjtil_ymo7hnjchaloy9cc">
         <w:r>
           <w:rPr>
             <w:rStyle w:val="Hyperlink"/>
@@ -9938,7 +9938,7 @@
         </w:rPr>
         <w:t xml:space="preserve">4　</w:t>
       </w:r>
-      <w:hyperlink w:history="1" r:id="rIdtzscugfllbfabdro9kepq">
+      <w:hyperlink w:history="1" r:id="rId3wqncz5pehlld3g7y9znk">
         <w:r>
           <w:rPr>
             <w:rStyle w:val="Hyperlink"/>
@@ -9964,7 +9964,7 @@
         </w:rPr>
         <w:t xml:space="preserve">5　</w:t>
       </w:r>
-      <w:hyperlink w:history="1" r:id="rIdyacep1beabfdo9kreznff">
+      <w:hyperlink w:history="1" r:id="rId0-doxmzodnhnjdoleizsw">
         <w:r>
           <w:rPr>
             <w:rStyle w:val="Hyperlink"/>
@@ -9990,7 +9990,7 @@
         </w:rPr>
         <w:t xml:space="preserve">6　</w:t>
       </w:r>
-      <w:hyperlink w:history="1" r:id="rIdmj8ocuxqesvget1r32vko">
+      <w:hyperlink w:history="1" r:id="rId5h9yvwnjz1br0g1zsi2xs">
         <w:r>
           <w:rPr>
             <w:rStyle w:val="Hyperlink"/>
@@ -10016,7 +10016,7 @@
         </w:rPr>
         <w:t xml:space="preserve">7　</w:t>
       </w:r>
-      <w:hyperlink w:history="1" r:id="rIddaljgn--qidshvzgfjp9k">
+      <w:hyperlink w:history="1" r:id="rIdo8677hh13hsgl1wrct71u">
         <w:r>
           <w:rPr>
             <w:rStyle w:val="Hyperlink"/>
@@ -10042,7 +10042,7 @@
         </w:rPr>
         <w:t xml:space="preserve">8　</w:t>
       </w:r>
-      <w:hyperlink w:history="1" r:id="rIdupks0s-merygux4-vfvvc">
+      <w:hyperlink w:history="1" r:id="rIddniui7fbpare_s_y0lkhq">
         <w:r>
           <w:rPr>
             <w:rStyle w:val="Hyperlink"/>
@@ -10068,7 +10068,7 @@
         </w:rPr>
         <w:t xml:space="preserve">9　</w:t>
       </w:r>
-      <w:hyperlink w:history="1" r:id="rIda_me7lllucen1ja5-elfe">
+      <w:hyperlink w:history="1" r:id="rIdwjxdavedoryzhqo7soxl8">
         <w:r>
           <w:rPr>
             <w:rStyle w:val="Hyperlink"/>
@@ -10094,7 +10094,7 @@
           <w:sz w:val="28"/>
           <w:szCs w:val="28"/>
         </w:rPr>
-        <w:t xml:space="preserve">undefined. undefined</w:t>
+        <w:t xml:space="preserve">9. 陸上專項活動要求</w:t>
       </w:r>
     </w:p>
     <w:p>
@@ -10110,7 +10110,7 @@
           <w:sz w:val="22"/>
           <w:szCs w:val="22"/>
         </w:rPr>
-        <w:t xml:space="preserve">undefined.1　</w:t>
+        <w:t xml:space="preserve">9.1　</w:t>
       </w:r>
       <w:r>
         <w:rPr>
@@ -10144,7 +10144,7 @@
           <w:sz w:val="22"/>
           <w:szCs w:val="22"/>
         </w:rPr>
-        <w:t xml:space="preserve">undefined.2　</w:t>
+        <w:t xml:space="preserve">9.2　</w:t>
       </w:r>
       <w:r>
         <w:rPr>
@@ -10178,7 +10178,7 @@
           <w:sz w:val="22"/>
           <w:szCs w:val="22"/>
         </w:rPr>
-        <w:t xml:space="preserve">undefined.3　</w:t>
+        <w:t xml:space="preserve">9.3　</w:t>
       </w:r>
       <w:r>
         <w:rPr>
@@ -10212,7 +10212,7 @@
           <w:sz w:val="22"/>
           <w:szCs w:val="22"/>
         </w:rPr>
-        <w:t xml:space="preserve">undefined.4　</w:t>
+        <w:t xml:space="preserve">9.4　</w:t>
       </w:r>
       <w:r>
         <w:rPr>
@@ -10264,7 +10264,7 @@
           <w:sz w:val="22"/>
           <w:szCs w:val="22"/>
         </w:rPr>
-        <w:t xml:space="preserve">undefined.5　</w:t>
+        <w:t xml:space="preserve">9.5　</w:t>
       </w:r>
       <w:r>
         <w:rPr>
@@ -10688,7 +10688,7 @@
           <w:sz w:val="22"/>
           <w:szCs w:val="22"/>
         </w:rPr>
-        <w:t xml:space="preserve">undefined.6　</w:t>
+        <w:t xml:space="preserve">9.6　</w:t>
       </w:r>
       <w:r>
         <w:rPr>
@@ -10722,7 +10722,7 @@
           <w:sz w:val="22"/>
           <w:szCs w:val="22"/>
         </w:rPr>
-        <w:t xml:space="preserve">undefined.7　</w:t>
+        <w:t xml:space="preserve">9.7　</w:t>
       </w:r>
       <w:r>
         <w:rPr>
@@ -10756,7 +10756,7 @@
           <w:sz w:val="22"/>
           <w:szCs w:val="22"/>
         </w:rPr>
-        <w:t xml:space="preserve">undefined.8　</w:t>
+        <w:t xml:space="preserve">9.8　</w:t>
       </w:r>
       <w:r>
         <w:rPr>
@@ -10807,7 +10807,7 @@
         </w:rPr>
         <w:t xml:space="preserve">1　</w:t>
       </w:r>
-      <w:hyperlink w:history="1" r:id="rIdcnaek3-o5va_rl9_dvoju">
+      <w:hyperlink w:history="1" r:id="rIdqv8xigf9mgq6ssdjorm6m">
         <w:r>
           <w:rPr>
             <w:rStyle w:val="Hyperlink"/>
@@ -10833,7 +10833,7 @@
         </w:rPr>
         <w:t xml:space="preserve">2, 3, 5　</w:t>
       </w:r>
-      <w:hyperlink w:history="1" r:id="rId4tmo0ezs4pnsjcx1wl_p2">
+      <w:hyperlink w:history="1" r:id="rId_-5-ndpgg-njslgft9-da">
         <w:r>
           <w:rPr>
             <w:rStyle w:val="Hyperlink"/>
@@ -10859,7 +10859,7 @@
         </w:rPr>
         <w:t xml:space="preserve">4　</w:t>
       </w:r>
-      <w:hyperlink w:history="1" r:id="rId_iwv4veo6b4o2tufra-p5">
+      <w:hyperlink w:history="1" r:id="rId4kjm9qghwhbjnibvfvq7m">
         <w:r>
           <w:rPr>
             <w:rStyle w:val="Hyperlink"/>
@@ -10885,7 +10885,7 @@
         </w:rPr>
         <w:t xml:space="preserve">6　</w:t>
       </w:r>
-      <w:hyperlink w:history="1" r:id="rIdrl52y1f4gpcfhon53oxuw">
+      <w:hyperlink w:history="1" r:id="rIdsphpowoaz71towp3dw9ic">
         <w:r>
           <w:rPr>
             <w:rStyle w:val="Hyperlink"/>
@@ -10911,7 +10911,7 @@
         </w:rPr>
         <w:t xml:space="preserve">7, 8　</w:t>
       </w:r>
-      <w:hyperlink w:history="1" r:id="rId37b6glthwmdb-m96bbuiw">
+      <w:hyperlink w:history="1" r:id="rIdkgu0qqlpuu-j_pc4rxi1l">
         <w:r>
           <w:rPr>
             <w:rStyle w:val="Hyperlink"/>
@@ -10937,7 +10937,7 @@
         </w:rPr>
         <w:t xml:space="preserve">9　</w:t>
       </w:r>
-      <w:hyperlink w:history="1" r:id="rIdtzorh1plocccmsw_oqbvr">
+      <w:hyperlink w:history="1" r:id="rIdqrbuufmfxtk0q5afi02w2">
         <w:r>
           <w:rPr>
             <w:rStyle w:val="Hyperlink"/>
@@ -10963,7 +10963,7 @@
         </w:rPr>
         <w:t xml:space="preserve">10　</w:t>
       </w:r>
-      <w:hyperlink w:history="1" r:id="rIdf3p5h5bjppmqqkjy7u_eq">
+      <w:hyperlink w:history="1" r:id="rIdmrned88smz4-gry2ncngh">
         <w:r>
           <w:rPr>
             <w:rStyle w:val="Hyperlink"/>
@@ -10989,7 +10989,7 @@
           <w:sz w:val="28"/>
           <w:szCs w:val="28"/>
         </w:rPr>
-        <w:t xml:space="preserve">undefined. undefined</w:t>
+        <w:t xml:space="preserve">10. 師生比例規定</w:t>
       </w:r>
     </w:p>
     <w:p>
@@ -11005,7 +11005,7 @@
           <w:sz w:val="22"/>
           <w:szCs w:val="22"/>
         </w:rPr>
-        <w:t xml:space="preserve">undefined.1　</w:t>
+        <w:t xml:space="preserve">10.1　</w:t>
       </w:r>
       <w:r>
         <w:rPr>
@@ -11039,7 +11039,7 @@
           <w:sz w:val="22"/>
           <w:szCs w:val="22"/>
         </w:rPr>
-        <w:t xml:space="preserve">undefined.2　</w:t>
+        <w:t xml:space="preserve">10.2　</w:t>
       </w:r>
       <w:r>
         <w:rPr>
@@ -11073,7 +11073,7 @@
           <w:sz w:val="22"/>
           <w:szCs w:val="22"/>
         </w:rPr>
-        <w:t xml:space="preserve">undefined.3　</w:t>
+        <w:t xml:space="preserve">10.3　</w:t>
       </w:r>
       <w:r>
         <w:rPr>
@@ -11107,7 +11107,7 @@
           <w:sz w:val="22"/>
           <w:szCs w:val="22"/>
         </w:rPr>
-        <w:t xml:space="preserve">undefined.4　</w:t>
+        <w:t xml:space="preserve">10.4　</w:t>
       </w:r>
       <w:r>
         <w:rPr>
@@ -11141,7 +11141,7 @@
           <w:sz w:val="22"/>
           <w:szCs w:val="22"/>
         </w:rPr>
-        <w:t xml:space="preserve">undefined.5　</w:t>
+        <w:t xml:space="preserve">10.5　</w:t>
       </w:r>
       <w:r>
         <w:rPr>
@@ -11175,7 +11175,7 @@
           <w:sz w:val="22"/>
           <w:szCs w:val="22"/>
         </w:rPr>
-        <w:t xml:space="preserve">undefined.6　</w:t>
+        <w:t xml:space="preserve">10.6　</w:t>
       </w:r>
       <w:r>
         <w:rPr>
@@ -11976,7 +11976,7 @@
         </w:rPr>
         <w:t xml:space="preserve">1, 2, 3, 4, 5, 6　</w:t>
       </w:r>
-      <w:hyperlink w:history="1" r:id="rIdl_jm8q03y7s1mi9uxi-c9">
+      <w:hyperlink w:history="1" r:id="rIdzvqpcuxi0a4auag1nw35n">
         <w:r>
           <w:rPr>
             <w:rStyle w:val="Hyperlink"/>
@@ -12002,7 +12002,7 @@
           <w:sz w:val="28"/>
           <w:szCs w:val="28"/>
         </w:rPr>
-        <w:t xml:space="preserve">undefined. undefined</w:t>
+        <w:t xml:space="preserve">11. 家長溝通與同意</w:t>
       </w:r>
     </w:p>
     <w:p>
@@ -12018,7 +12018,7 @@
           <w:sz w:val="22"/>
           <w:szCs w:val="22"/>
         </w:rPr>
-        <w:t xml:space="preserve">undefined.1　</w:t>
+        <w:t xml:space="preserve">11.1　</w:t>
       </w:r>
       <w:r>
         <w:rPr>
@@ -12087,7 +12087,7 @@
           <w:sz w:val="22"/>
           <w:szCs w:val="22"/>
         </w:rPr>
-        <w:t xml:space="preserve">undefined.2　</w:t>
+        <w:t xml:space="preserve">11.2　</w:t>
       </w:r>
       <w:r>
         <w:rPr>
@@ -12121,7 +12121,7 @@
           <w:sz w:val="22"/>
           <w:szCs w:val="22"/>
         </w:rPr>
-        <w:t xml:space="preserve">undefined.3　</w:t>
+        <w:t xml:space="preserve">11.3　</w:t>
       </w:r>
       <w:r>
         <w:rPr>
@@ -13060,7 +13060,7 @@
         </w:rPr>
         <w:t xml:space="preserve">1　</w:t>
       </w:r>
-      <w:hyperlink w:history="1" r:id="rIdpj0bsuty6zpp7cmmuovpy">
+      <w:hyperlink w:history="1" r:id="rIdiv3apyau8iaqqufdh9efy">
         <w:r>
           <w:rPr>
             <w:rStyle w:val="Hyperlink"/>
@@ -13086,7 +13086,7 @@
         </w:rPr>
         <w:t xml:space="preserve">2　</w:t>
       </w:r>
-      <w:hyperlink w:history="1" r:id="rIdzsakcsuxzgxcltf9k68gk">
+      <w:hyperlink w:history="1" r:id="rIdbtflft9s3ynmmpmgjqacs">
         <w:r>
           <w:rPr>
             <w:rStyle w:val="Hyperlink"/>
@@ -13112,7 +13112,7 @@
         </w:rPr>
         <w:t xml:space="preserve">3　</w:t>
       </w:r>
-      <w:hyperlink w:history="1" r:id="rId1xl_5liukixl0dhn4dgdv">
+      <w:hyperlink w:history="1" r:id="rIdvx5uctdleg4es3_mftnmt">
         <w:r>
           <w:rPr>
             <w:rStyle w:val="Hyperlink"/>
@@ -13138,7 +13138,7 @@
         </w:rPr>
         <w:t xml:space="preserve">4　</w:t>
       </w:r>
-      <w:hyperlink w:history="1" r:id="rIdr5eukql3nlhchlajz5bdu">
+      <w:hyperlink w:history="1" r:id="rIdfi5yw2k8wx7tgtl95ffdk">
         <w:r>
           <w:rPr>
             <w:rStyle w:val="Hyperlink"/>
@@ -13164,7 +13164,7 @@
         </w:rPr>
         <w:t xml:space="preserve">5　</w:t>
       </w:r>
-      <w:hyperlink w:history="1" r:id="rId0qq8vj48d2fueiqbdnp2b">
+      <w:hyperlink w:history="1" r:id="rIdirkumea9ef84y0trx0m6q">
         <w:r>
           <w:rPr>
             <w:rStyle w:val="Hyperlink"/>
@@ -13190,7 +13190,7 @@
           <w:sz w:val="28"/>
           <w:szCs w:val="28"/>
         </w:rPr>
-        <w:t xml:space="preserve">undefined. undefined</w:t>
+        <w:t xml:space="preserve">12. 收費與財務記錄</w:t>
       </w:r>
     </w:p>
     <w:p>
@@ -13206,7 +13206,7 @@
           <w:sz w:val="22"/>
           <w:szCs w:val="22"/>
         </w:rPr>
-        <w:t xml:space="preserve">undefined.1　</w:t>
+        <w:t xml:space="preserve">12.1　</w:t>
       </w:r>
       <w:r>
         <w:rPr>
@@ -13257,7 +13257,7 @@
           <w:sz w:val="22"/>
           <w:szCs w:val="22"/>
         </w:rPr>
-        <w:t xml:space="preserve">undefined.2　</w:t>
+        <w:t xml:space="preserve">12.2　</w:t>
       </w:r>
       <w:r>
         <w:rPr>
@@ -13846,7 +13846,7 @@
         </w:rPr>
         <w:t xml:space="preserve">1　</w:t>
       </w:r>
-      <w:hyperlink w:history="1" r:id="rIdtope2oba5fmdm6qtkxq6_">
+      <w:hyperlink w:history="1" r:id="rIdcotuhnroti7bt72owuzlq">
         <w:r>
           <w:rPr>
             <w:rStyle w:val="Hyperlink"/>
@@ -13872,7 +13872,7 @@
         </w:rPr>
         <w:t xml:space="preserve">2　</w:t>
       </w:r>
-      <w:hyperlink w:history="1" r:id="rIdwh5-q9tjafkacx-txksoj">
+      <w:hyperlink w:history="1" r:id="rId8lkwr2expsjn3oisxr7ml">
         <w:r>
           <w:rPr>
             <w:rStyle w:val="Hyperlink"/>
@@ -13898,7 +13898,7 @@
         </w:rPr>
         <w:t xml:space="preserve">3　</w:t>
       </w:r>
-      <w:hyperlink w:history="1" r:id="rIdfchkf_pcmhk6uyagj_y1z">
+      <w:hyperlink w:history="1" r:id="rIdke5zdagpespdqtlnjse_t">
         <w:r>
           <w:rPr>
             <w:rStyle w:val="Hyperlink"/>
@@ -13924,7 +13924,7 @@
         </w:rPr>
         <w:t xml:space="preserve">4　</w:t>
       </w:r>
-      <w:hyperlink w:history="1" r:id="rId6trmp2-fgedgegih-gzn5">
+      <w:hyperlink w:history="1" r:id="rIdu2dg9xf5myuplqbhv0j-w">
         <w:r>
           <w:rPr>
             <w:rStyle w:val="Hyperlink"/>
@@ -13950,7 +13950,7 @@
         </w:rPr>
         <w:t xml:space="preserve">5　</w:t>
       </w:r>
-      <w:hyperlink w:history="1" r:id="rIdodosqdblyx-akx5mhhh2v">
+      <w:hyperlink w:history="1" r:id="rIdh5xfabp1whusyjgkx_xjx">
         <w:r>
           <w:rPr>
             <w:rStyle w:val="Hyperlink"/>

</xml_diff>